<commit_message>
added everything to be marked and updated work log
</commit_message>
<xml_diff>
--- a/Project Plan.docx
+++ b/Project Plan.docx
@@ -242,7 +242,16 @@
         </w:numPr>
       </w:pPr>
       <w:r>
-        <w:t>10/04.2026 - Review of deliverables to see if up to spec</w:t>
+        <w:t>7</w:t>
+      </w:r>
+      <w:r>
+        <w:t>/0</w:t>
+      </w:r>
+      <w:r>
+        <w:t>5</w:t>
+      </w:r>
+      <w:r>
+        <w:t>.2026 - Review of deliverables to see if up to spec</w:t>
       </w:r>
     </w:p>
     <w:p>
@@ -254,7 +263,16 @@
         </w:numPr>
       </w:pPr>
       <w:r>
-        <w:t>20/04/2026 - Presentation is delivered</w:t>
+        <w:t>12</w:t>
+      </w:r>
+      <w:r>
+        <w:t>/0</w:t>
+      </w:r>
+      <w:r>
+        <w:t>5</w:t>
+      </w:r>
+      <w:r>
+        <w:t>/2026 - Presentation is delivered</w:t>
       </w:r>
     </w:p>
     <w:p>
@@ -303,23 +321,6 @@
     <w:p>
       <w:r>
         <w:t>Deliverables will be stored on GitHub, and teams will be used as an intermediary for any other pieces of work or unfinished work.</w:t>
-      </w:r>
-    </w:p>
-    <w:p>
-      <w:r>
-        <w:rPr>
-          <w:b/>
-          <w:bCs/>
-        </w:rPr>
-        <w:t>Work Tracking</w:t>
-      </w:r>
-      <w:r>
-        <w:t> </w:t>
-      </w:r>
-    </w:p>
-    <w:p>
-      <w:r>
-        <w:t>Work will be tracked via an excel document which looks at work assigned that week and work if that work has been completed. </w:t>
       </w:r>
     </w:p>
     <w:p/>
@@ -1262,6 +1263,7 @@
   <w:style w:type="character" w:default="1" w:styleId="DefaultParagraphFont">
     <w:name w:val="Default Paragraph Font"/>
     <w:uiPriority w:val="1"/>
+    <w:semiHidden/>
     <w:unhideWhenUsed/>
   </w:style>
   <w:style w:type="table" w:default="1" w:styleId="TableNormal">

</xml_diff>